<commit_message>
docs: refresh eval README + AI_Tutor_Eval_Harness.docx for Phase 7
README rewrite reflects the current shape of the harness: 80 scenarios
across 6 personas + 2 subjects + 2 execution modes, 3-layer scoring
(deterministic / judge-derived / LLM rubric), the 8 BEA-aligned
standard rubric items per scenario, simple_tutor as the going-forward
engine target. Removes Phase-1 framing and stale assertion-verb
references.

build_eval_doc.py + the regenerated DOCX update the cover sheet
(branch, Phases 1-7, engine target, BEA rubric structure) and replace
the must_end_with_question sample assertion with the equivalent
rubric-layer wording.

Co-Authored-By: Claude Opus 4.7 (1M context) <noreply@anthropic.com>
</commit_message>
<xml_diff>
--- a/AI_Tutor_Eval_Harness.docx
+++ b/AI_Tutor_Eval_Harness.docx
@@ -62,7 +62,7 @@
           <w:color w:val="888888"/>
           <w:sz w:val="20"/>
         </w:rPr>
-        <w:t>Branch: dev   ·   Phases 1–6 shipped + bug-fix revision</w:t>
+        <w:t>Branch: pixeldesignlabs-dev   ·   Phases 1–7 shipped</w:t>
       </w:r>
     </w:p>
     <w:p>
@@ -75,6 +75,30 @@
           <w:sz w:val="20"/>
         </w:rPr>
         <w:t>Dataset: 80 scenarios   ·   Personas: 6   ·   Subjects: math, geography</w:t>
+      </w:r>
+    </w:p>
+    <w:p>
+      <w:pPr>
+        <w:jc w:val="center"/>
+      </w:pPr>
+      <w:r>
+        <w:rPr>
+          <w:color w:val="888888"/>
+          <w:sz w:val="20"/>
+        </w:rPr>
+        <w:t>Engine target: simple_tutor (SIMPLE_TUTOR_ENGINE=1)</w:t>
+      </w:r>
+    </w:p>
+    <w:p>
+      <w:pPr>
+        <w:jc w:val="center"/>
+      </w:pPr>
+      <w:r>
+        <w:rPr>
+          <w:color w:val="888888"/>
+          <w:sz w:val="20"/>
+        </w:rPr>
+        <w:t>Rubric: scenario-specific items + 8 BEA-aligned standard items per scenario</w:t>
       </w:r>
     </w:p>
     <w:p>
@@ -1587,8 +1611,6 @@
         <w:br/>
         <w:t xml:space="preserve">  max_paragraphs: 1                       # one-paragraph format rule</w:t>
         <w:br/>
-        <w:t xml:space="preserve">  must_end_with_question: true            # last sentence ends in '?'</w:t>
-        <w:br/>
         <w:t xml:space="preserve">  must_not_contain_phrase:                # forbidden literal phrases</w:t>
         <w:br/>
         <w:t xml:space="preserve">    - "let me check"</w:t>
@@ -1604,11 +1626,41 @@
         <w:br/>
         <w:t>rubric:</w:t>
         <w:br/>
+        <w:t xml:space="preserve">  # SCENARIO-SPECIFIC items — author per scenario:</w:t>
+        <w:br/>
         <w:t xml:space="preserve">  - "Confirms '145' is correct — briefly, without effusive praise"</w:t>
         <w:br/>
         <w:t xml:space="preserve">  - "Advances the lesson rather than re-probing already-shown working"</w:t>
         <w:br/>
         <w:t xml:space="preserve">  - "Does NOT second-guess a correct answer"</w:t>
+        <w:br/>
+        <w:t xml:space="preserve">  # --- BEA-aligned standard rubric (universal across scenarios) ---</w:t>
+        <w:br/>
+        <w:t xml:space="preserve">  # The 8 dimensions below are appended to every scenario by</w:t>
+        <w:br/>
+        <w:t xml:space="preserve">  # scripts/migrate_bea_rubric.py. They give cross-scenario coverage on</w:t>
+        <w:br/>
+        <w:t xml:space="preserve">  # the BEA-2025 evaluation dimensions: mistake identification, mistake</w:t>
+        <w:br/>
+        <w:t xml:space="preserve">  # location, no-answer-reveal, providing guidance, actionability,</w:t>
+        <w:br/>
+        <w:t xml:space="preserve">  # coherence, tutor tone, human-likeness.</w:t>
+        <w:br/>
+        <w:t xml:space="preserve">  - "If the student made a mistake, the response identifies or recognises it..."</w:t>
+        <w:br/>
+        <w:t xml:space="preserve">  - "If a mistake exists, the response points at its specific location..."</w:t>
+        <w:br/>
+        <w:t xml:space="preserve">  - "The response does NOT reveal the final answer outright..."</w:t>
+        <w:br/>
+        <w:t xml:space="preserve">  - "The response offers correct and relevant guidance..."</w:t>
+        <w:br/>
+        <w:t xml:space="preserve">  - "It is clear from the response what the student should do next..."</w:t>
+        <w:br/>
+        <w:t xml:space="preserve">  - "The response is logically consistent with the conversation so far..."</w:t>
+        <w:br/>
+        <w:t xml:space="preserve">  - "The tutor's tone is warm and encouraging..."</w:t>
+        <w:br/>
+        <w:t xml:space="preserve">  - "The response sounds natural and conversational, not robotic..."</w:t>
         <w:br/>
         <w:t>pass_threshold: 0.7                       # rubric mean must be &gt;= this</w:t>
         <w:br/>
@@ -2005,28 +2057,6 @@
           </w:tcPr>
           <w:p>
             <w:r>
-              <w:t>must_end_with_question</w:t>
-            </w:r>
-          </w:p>
-        </w:tc>
-        <w:tc>
-          <w:tcPr>
-            <w:tcW w:type="dxa" w:w="4320"/>
-          </w:tcPr>
-          <w:p>
-            <w:r>
-              <w:t>The last sentence ends with `?`.</w:t>
-            </w:r>
-          </w:p>
-        </w:tc>
-      </w:tr>
-      <w:tr>
-        <w:tc>
-          <w:tcPr>
-            <w:tcW w:type="dxa" w:w="4320"/>
-          </w:tcPr>
-          <w:p>
-            <w:r>
               <w:t>max_paragraphs</w:t>
             </w:r>
           </w:p>
@@ -2043,6 +2073,23 @@
         </w:tc>
       </w:tr>
     </w:tbl>
+    <w:p>
+      <w:pPr>
+        <w:ind w:left="360"/>
+      </w:pPr>
+      <w:r>
+        <w:rPr>
+          <w:b/>
+        </w:rPr>
+        <w:t xml:space="preserve">Note: </w:t>
+      </w:r>
+      <w:r>
+        <w:rPr>
+          <w:i/>
+        </w:rPr>
+        <w:t>`must_end_with_question` was removed on 2026-05-27. "Does the response leave the student with an action" is a semantic judgement no regex can make reliably — imperatives, indirect prompts, MCQ patterns, and novel phrasings all overlap with non-action prose in ways that escape syntactic detection. The check moved to the rubric layer as an actionability item that an LLM judge can score by reading the response.</w:t>
+      </w:r>
+    </w:p>
     <w:p>
       <w:r>
         <w:rPr>
@@ -2213,7 +2260,7 @@
           <w:b w:val="0"/>
           <w:i w:val="0"/>
         </w:rPr>
-        <w:t>The rubric judge is pinned to a specific model and temperature 0 (set as `DEFAULT_RUBRIC_JUDGE` in `llm_rubric.py`) so that the rubric layer is as reproducible as the deterministic layer. Scenarios can override the judge per-file via a `rubric_judge:` block if they need a stronger model for harder rubric items.</w:t>
+        <w:t>The rubric judge is pinned to a specific model and temperature 0 (set as `DEFAULT_RUBRIC_JUDGE` in `llm_rubric.py`) so that the rubric layer is as reproducible as the deterministic layer. Scenarios can override the judge per-file via a `rubric_judge:` block if they need a stronger model for harder rubric items. The default carries `max_tokens=3072` to comfortably accommodate the ~12-item rubrics every scenario now has (8 BEA standard items plus 3–5 scenario-specific ones).</w:t>
       </w:r>
     </w:p>
     <w:p>
@@ -2221,7 +2268,361 @@
         <w:pStyle w:val="Heading2"/>
       </w:pPr>
       <w:r>
-        <w:t>12. The lesson fixtures — why we freeze content</w:t>
+        <w:t>12. The BEA-aligned standard rubric</w:t>
+      </w:r>
+    </w:p>
+    <w:p>
+      <w:r>
+        <w:rPr>
+          <w:b w:val="0"/>
+          <w:i w:val="0"/>
+        </w:rPr>
+        <w:t>Every scenario's rubric block carries two kinds of items: **scenario-specific items** (3–5 per scenario, written by the author to catch a particular failure mode) and the **8 BEA-aligned standard items** (universal across all scenarios). The standard items derive from the BEA-2025 shared-task evaluation rubric and provide uniform cross-scenario coverage on dimensions that no single regex can capture.</w:t>
+      </w:r>
+    </w:p>
+    <w:p>
+      <w:r>
+        <w:rPr>
+          <w:b w:val="0"/>
+          <w:i w:val="0"/>
+        </w:rPr>
+        <w:t>The 8 standard dimensions:</w:t>
+      </w:r>
+    </w:p>
+    <w:tbl>
+      <w:tblPr>
+        <w:tblStyle w:val="LightGrid-Accent1"/>
+        <w:tblW w:type="auto" w:w="0"/>
+        <w:jc w:val="left"/>
+        <w:tblLook w:firstColumn="1" w:firstRow="1" w:lastColumn="0" w:lastRow="0" w:noHBand="0" w:noVBand="1" w:val="04A0"/>
+      </w:tblPr>
+      <w:tblGrid>
+        <w:gridCol w:w="2880"/>
+        <w:gridCol w:w="2880"/>
+        <w:gridCol w:w="2880"/>
+      </w:tblGrid>
+      <w:tr>
+        <w:tc>
+          <w:tcPr>
+            <w:tcW w:type="dxa" w:w="2880"/>
+          </w:tcPr>
+          <w:p>
+            <w:r>
+              <w:rPr>
+                <w:b/>
+              </w:rPr>
+              <w:t>#</w:t>
+            </w:r>
+          </w:p>
+        </w:tc>
+        <w:tc>
+          <w:tcPr>
+            <w:tcW w:type="dxa" w:w="2880"/>
+          </w:tcPr>
+          <w:p>
+            <w:r>
+              <w:rPr>
+                <w:b/>
+              </w:rPr>
+              <w:t>Dimension</w:t>
+            </w:r>
+          </w:p>
+        </w:tc>
+        <w:tc>
+          <w:tcPr>
+            <w:tcW w:type="dxa" w:w="2880"/>
+          </w:tcPr>
+          <w:p>
+            <w:r>
+              <w:rPr>
+                <w:b/>
+              </w:rPr>
+              <w:t>What the rubric judge looks for</w:t>
+            </w:r>
+          </w:p>
+        </w:tc>
+      </w:tr>
+      <w:tr>
+        <w:tc>
+          <w:tcPr>
+            <w:tcW w:type="dxa" w:w="2880"/>
+          </w:tcPr>
+          <w:p>
+            <w:r>
+              <w:t>1</w:t>
+            </w:r>
+          </w:p>
+        </w:tc>
+        <w:tc>
+          <w:tcPr>
+            <w:tcW w:type="dxa" w:w="2880"/>
+          </w:tcPr>
+          <w:p>
+            <w:r>
+              <w:t>Mistake identification</w:t>
+            </w:r>
+          </w:p>
+        </w:tc>
+        <w:tc>
+          <w:tcPr>
+            <w:tcW w:type="dxa" w:w="2880"/>
+          </w:tcPr>
+          <w:p>
+            <w:r>
+              <w:t>If the student made a mistake, the response identifies or recognises it; if the student was correct, the response affirms that clearly without false hedging.</w:t>
+            </w:r>
+          </w:p>
+        </w:tc>
+      </w:tr>
+      <w:tr>
+        <w:tc>
+          <w:tcPr>
+            <w:tcW w:type="dxa" w:w="2880"/>
+          </w:tcPr>
+          <w:p>
+            <w:r>
+              <w:t>2</w:t>
+            </w:r>
+          </w:p>
+        </w:tc>
+        <w:tc>
+          <w:tcPr>
+            <w:tcW w:type="dxa" w:w="2880"/>
+          </w:tcPr>
+          <w:p>
+            <w:r>
+              <w:t>Mistake location</w:t>
+            </w:r>
+          </w:p>
+        </w:tc>
+        <w:tc>
+          <w:tcPr>
+            <w:tcW w:type="dxa" w:w="2880"/>
+          </w:tcPr>
+          <w:p>
+            <w:r>
+              <w:t>If a mistake exists, the response points at its specific location or nature (a step, a misconception, an arithmetic slip), not just a generic "try again".</w:t>
+            </w:r>
+          </w:p>
+        </w:tc>
+      </w:tr>
+      <w:tr>
+        <w:tc>
+          <w:tcPr>
+            <w:tcW w:type="dxa" w:w="2880"/>
+          </w:tcPr>
+          <w:p>
+            <w:r>
+              <w:t>3</w:t>
+            </w:r>
+          </w:p>
+        </w:tc>
+        <w:tc>
+          <w:tcPr>
+            <w:tcW w:type="dxa" w:w="2880"/>
+          </w:tcPr>
+          <w:p>
+            <w:r>
+              <w:t>No answer reveal</w:t>
+            </w:r>
+          </w:p>
+        </w:tc>
+        <w:tc>
+          <w:tcPr>
+            <w:tcW w:type="dxa" w:w="2880"/>
+          </w:tcPr>
+          <w:p>
+            <w:r>
+              <w:t>The response does NOT reveal the final answer outright. Partial hints calibrated to the student's level are acceptable; handing over the canonical value is not.</w:t>
+            </w:r>
+          </w:p>
+        </w:tc>
+      </w:tr>
+      <w:tr>
+        <w:tc>
+          <w:tcPr>
+            <w:tcW w:type="dxa" w:w="2880"/>
+          </w:tcPr>
+          <w:p>
+            <w:r>
+              <w:t>4</w:t>
+            </w:r>
+          </w:p>
+        </w:tc>
+        <w:tc>
+          <w:tcPr>
+            <w:tcW w:type="dxa" w:w="2880"/>
+          </w:tcPr>
+          <w:p>
+            <w:r>
+              <w:t>Providing guidance</w:t>
+            </w:r>
+          </w:p>
+        </w:tc>
+        <w:tc>
+          <w:tcPr>
+            <w:tcW w:type="dxa" w:w="2880"/>
+          </w:tcPr>
+          <w:p>
+            <w:r>
+              <w:t>The response offers correct and relevant guidance — explanation, elaboration, hint, worked example, scaffolding — at the student's level.</w:t>
+            </w:r>
+          </w:p>
+        </w:tc>
+      </w:tr>
+      <w:tr>
+        <w:tc>
+          <w:tcPr>
+            <w:tcW w:type="dxa" w:w="2880"/>
+          </w:tcPr>
+          <w:p>
+            <w:r>
+              <w:t>5</w:t>
+            </w:r>
+          </w:p>
+        </w:tc>
+        <w:tc>
+          <w:tcPr>
+            <w:tcW w:type="dxa" w:w="2880"/>
+          </w:tcPr>
+          <w:p>
+            <w:r>
+              <w:t>Actionability</w:t>
+            </w:r>
+          </w:p>
+        </w:tc>
+        <w:tc>
+          <w:tcPr>
+            <w:tcW w:type="dxa" w:w="2880"/>
+          </w:tcPr>
+          <w:p>
+            <w:r>
+              <w:t>It is clear from the response what the student should do next — a specific question, an MCQ option to pick, a calculation to perform, or another structured prompt.</w:t>
+            </w:r>
+          </w:p>
+        </w:tc>
+      </w:tr>
+      <w:tr>
+        <w:tc>
+          <w:tcPr>
+            <w:tcW w:type="dxa" w:w="2880"/>
+          </w:tcPr>
+          <w:p>
+            <w:r>
+              <w:t>6</w:t>
+            </w:r>
+          </w:p>
+        </w:tc>
+        <w:tc>
+          <w:tcPr>
+            <w:tcW w:type="dxa" w:w="2880"/>
+          </w:tcPr>
+          <w:p>
+            <w:r>
+              <w:t>Coherence</w:t>
+            </w:r>
+          </w:p>
+        </w:tc>
+        <w:tc>
+          <w:tcPr>
+            <w:tcW w:type="dxa" w:w="2880"/>
+          </w:tcPr>
+          <w:p>
+            <w:r>
+              <w:t>The response is logically consistent with the conversation so far; does not contradict its own prior turns or ignore what the student just said.</w:t>
+            </w:r>
+          </w:p>
+        </w:tc>
+      </w:tr>
+      <w:tr>
+        <w:tc>
+          <w:tcPr>
+            <w:tcW w:type="dxa" w:w="2880"/>
+          </w:tcPr>
+          <w:p>
+            <w:r>
+              <w:t>7</w:t>
+            </w:r>
+          </w:p>
+        </w:tc>
+        <w:tc>
+          <w:tcPr>
+            <w:tcW w:type="dxa" w:w="2880"/>
+          </w:tcPr>
+          <w:p>
+            <w:r>
+              <w:t>Tutor tone</w:t>
+            </w:r>
+          </w:p>
+        </w:tc>
+        <w:tc>
+          <w:tcPr>
+            <w:tcW w:type="dxa" w:w="2880"/>
+          </w:tcPr>
+          <w:p>
+            <w:r>
+              <w:t>The response is warm and encouraging — supportive without being condescending, honest without being harsh. Never offensive or dismissive.</w:t>
+            </w:r>
+          </w:p>
+        </w:tc>
+      </w:tr>
+      <w:tr>
+        <w:tc>
+          <w:tcPr>
+            <w:tcW w:type="dxa" w:w="2880"/>
+          </w:tcPr>
+          <w:p>
+            <w:r>
+              <w:t>8</w:t>
+            </w:r>
+          </w:p>
+        </w:tc>
+        <w:tc>
+          <w:tcPr>
+            <w:tcW w:type="dxa" w:w="2880"/>
+          </w:tcPr>
+          <w:p>
+            <w:r>
+              <w:t>Human-likeness</w:t>
+            </w:r>
+          </w:p>
+        </w:tc>
+        <w:tc>
+          <w:tcPr>
+            <w:tcW w:type="dxa" w:w="2880"/>
+          </w:tcPr>
+          <w:p>
+            <w:r>
+              <w:t>The response sounds natural and conversational, not robotic, templated, or padded with filler openers ("Great question!", "Let me think about this carefully").</w:t>
+            </w:r>
+          </w:p>
+        </w:tc>
+      </w:tr>
+    </w:tbl>
+    <w:p>
+      <w:r>
+        <w:rPr>
+          <w:b/>
+          <w:i w:val="0"/>
+        </w:rPr>
+        <w:t>Why both layers — scenario-specific AND standard</w:t>
+      </w:r>
+    </w:p>
+    <w:p>
+      <w:r>
+        <w:rPr>
+          <w:b w:val="0"/>
+          <w:i w:val="0"/>
+        </w:rPr>
+        <w:t>Scenario-specific items act as fine-grained failure detectors tied to a particular pedagogical moment ("Surfaces the SPECIFIC misconception (used 270 instead of 360)"). The standard items act as an always-on baseline ("If a mistake exists, the response points at its specific location or nature"). Both vote into the rubric mean, so a scenario can fail on the specific item even when the standard items pass — the specific item carries more diagnostic weight for that particular failure mode. The standard set is appended to every scenario by `scripts/migrate_bea_rubric.py`, which is idempotent (it carries a sentinel comment and skips already-migrated files).</w:t>
+      </w:r>
+    </w:p>
+    <w:p>
+      <w:pPr>
+        <w:pStyle w:val="Heading2"/>
+      </w:pPr>
+      <w:r>
+        <w:t>13. The lesson fixtures — why we freeze content</w:t>
       </w:r>
     </w:p>
     <w:p>
@@ -2297,7 +2698,7 @@
         <w:pStyle w:val="Heading2"/>
       </w:pPr>
       <w:r>
-        <w:t>13. The report tool</w:t>
+        <w:t>14. The report tool</w:t>
       </w:r>
     </w:p>
     <w:p>
@@ -2421,7 +2822,7 @@
         <w:pStyle w:val="Heading2"/>
       </w:pPr>
       <w:r>
-        <w:t>14. Setup (one-time, per developer machine)</w:t>
+        <w:t>15. Setup (one-time, per developer machine)</w:t>
       </w:r>
     </w:p>
     <w:p>
@@ -2564,7 +2965,7 @@
         <w:pStyle w:val="Heading2"/>
       </w:pPr>
       <w:r>
-        <w:t>15. Running an evaluation</w:t>
+        <w:t>16. Running an evaluation</w:t>
       </w:r>
     </w:p>
     <w:p>
@@ -2748,7 +3149,7 @@
         <w:pStyle w:val="Heading2"/>
       </w:pPr>
       <w:r>
-        <w:t>16. Reading the results</w:t>
+        <w:t>17. Reading the results</w:t>
       </w:r>
     </w:p>
     <w:p>
@@ -2992,7 +3393,7 @@
         <w:pStyle w:val="Heading2"/>
       </w:pPr>
       <w:r>
-        <w:t>17. Iterating after a code change</w:t>
+        <w:t>18. Iterating after a code change</w:t>
       </w:r>
     </w:p>
     <w:p>
@@ -3095,7 +3496,7 @@
         <w:pStyle w:val="Heading2"/>
       </w:pPr>
       <w:r>
-        <w:t>18. The persona × situation matrix (current state)</w:t>
+        <w:t>19. The persona × situation matrix (current state)</w:t>
       </w:r>
     </w:p>
     <w:p>
@@ -3716,7 +4117,7 @@
         <w:pStyle w:val="Heading2"/>
       </w:pPr>
       <w:r>
-        <w:t>19. Failure category coverage</w:t>
+        <w:t>20. Failure category coverage</w:t>
       </w:r>
     </w:p>
     <w:p>
@@ -4426,7 +4827,7 @@
         <w:pStyle w:val="Heading2"/>
       </w:pPr>
       <w:r>
-        <w:t>20. Why curated YAML, not production sampling</w:t>
+        <w:t>21. Why curated YAML, not production sampling</w:t>
       </w:r>
     </w:p>
     <w:p>
@@ -4476,7 +4877,7 @@
         <w:pStyle w:val="Heading2"/>
       </w:pPr>
       <w:r>
-        <w:t>21. Why three scoring layers and not one</w:t>
+        <w:t>22. Why three scoring layers and not one</w:t>
       </w:r>
     </w:p>
     <w:p>
@@ -4526,7 +4927,7 @@
         <w:pStyle w:val="Heading2"/>
       </w:pPr>
       <w:r>
-        <w:t>22. Why one paragraph, no question repetition, MCQ inline</w:t>
+        <w:t>23. Why one paragraph, no question repetition, MCQ inline</w:t>
       </w:r>
     </w:p>
     <w:p>
@@ -4597,7 +4998,7 @@
         <w:pStyle w:val="Heading2"/>
       </w:pPr>
       <w:r>
-        <w:t>23. Why post-impl paragraph collapse (the hard-won lesson)</w:t>
+        <w:t>24. Why post-impl paragraph collapse (the hard-won lesson)</w:t>
       </w:r>
     </w:p>
     <w:p>
@@ -4686,7 +5087,7 @@
         <w:pStyle w:val="Heading2"/>
       </w:pPr>
       <w:r>
-        <w:t>24. Why the dataset lives in the repo</w:t>
+        <w:t>25. Why the dataset lives in the repo</w:t>
       </w:r>
     </w:p>
     <w:p>
@@ -4749,7 +5150,7 @@
         <w:pStyle w:val="Heading2"/>
       </w:pPr>
       <w:r>
-        <w:t>25. The first real baseline</w:t>
+        <w:t>26. The first real baseline</w:t>
       </w:r>
     </w:p>
     <w:p>
@@ -4881,7 +5282,7 @@
         <w:pStyle w:val="Heading2"/>
       </w:pPr>
       <w:r>
-        <w:t>26. The bug pattern: pedagogy sound, format broken</w:t>
+        <w:t>27. The bug pattern: pedagogy sound, format broken</w:t>
       </w:r>
     </w:p>
     <w:p>
@@ -5089,7 +5490,7 @@
         <w:pStyle w:val="Heading2"/>
       </w:pPr>
       <w:r>
-        <w:t>27. The fixes</w:t>
+        <w:t>28. The fixes</w:t>
       </w:r>
     </w:p>
     <w:p>
@@ -5209,7 +5610,7 @@
         <w:pStyle w:val="Heading2"/>
       </w:pPr>
       <w:r>
-        <w:t>28. Dataset growth: 23 → 80</w:t>
+        <w:t>29. Dataset growth: 23 → 80</w:t>
       </w:r>
     </w:p>
     <w:p>
@@ -5555,7 +5956,7 @@
         <w:pStyle w:val="Heading2"/>
       </w:pPr>
       <w:r>
-        <w:t>29. Personas: 2 → 6 (then merged 6)</w:t>
+        <w:t>30. Personas: 2 → 6 (then merged 6)</w:t>
       </w:r>
     </w:p>
     <w:p>
@@ -5565,6 +5966,85 @@
           <w:i w:val="0"/>
         </w:rPr>
         <w:t>The original simulator had only 2 personas (struggler, capable). During the eval-harness build, three more were added (average, probe_resistant, non_responder) so multi-turn coverage could span the full 5-persona matrix the original plan called for. After a subsequent merge with the dev branch, error_prone was also added (a BEA-2025 coverage persona that always commits to a specific wrong answer). Total: 6 personas.</w:t>
+      </w:r>
+    </w:p>
+    <w:p>
+      <w:pPr>
+        <w:pStyle w:val="Heading2"/>
+      </w:pPr>
+      <w:r>
+        <w:t>31. BEA standard rubric + the action-rubric move</w:t>
+      </w:r>
+    </w:p>
+    <w:p>
+      <w:r>
+        <w:rPr>
+          <w:b w:val="0"/>
+          <w:i w:val="0"/>
+        </w:rPr>
+        <w:t>Phase 7 (latest revision) introduced two related changes:</w:t>
+      </w:r>
+    </w:p>
+    <w:p>
+      <w:r>
+        <w:rPr>
+          <w:b/>
+          <w:i w:val="0"/>
+        </w:rPr>
+        <w:t>`must_end_with_action` removed from the assertion layer.</w:t>
+      </w:r>
+    </w:p>
+    <w:p>
+      <w:r>
+        <w:rPr>
+          <w:b w:val="0"/>
+          <w:i w:val="0"/>
+        </w:rPr>
+        <w:t>The deterministic check originally tried to detect "did the tutor leave the student with an action" via three regex cases: trailing `?`, MCQ options block plus a `?` somewhere, or trailing fill-in-blank marker. Real tutor responses produced patterns the regex couldn't cleanly classify — e.g., the engine sometimes ended on an MCQ option line `D) 100 + 80 + x = 270` with the question mid-response, which one heuristic caught and another didn't. The judgement is fundamentally semantic ("does this prompt structure a next move?"), so the check moved to the rubric layer as a BEA #5 Actionability item that an LLM judge can read and reason about.</w:t>
+      </w:r>
+    </w:p>
+    <w:p>
+      <w:r>
+        <w:rPr>
+          <w:b/>
+          <w:i w:val="0"/>
+        </w:rPr>
+        <w:t>8 BEA-aligned standard rubric items appended to every scenario.</w:t>
+      </w:r>
+    </w:p>
+    <w:p>
+      <w:r>
+        <w:rPr>
+          <w:b w:val="0"/>
+          <w:i w:val="0"/>
+        </w:rPr>
+        <w:t>The BEA-2025 shared-task evaluation rubric defines 8 pedagogical dimensions every tutor response should be judged on: mistake identification, mistake location, no-answer-reveal, providing guidance, actionability, coherence, tutor tone, and human-likeness. `scripts/migrate_bea_rubric.py` appends these 8 items to every scenario's `rubric:` block, alongside the scenario-specific items. Two effects: (1) every scenario is now scored on the same 8 universal dimensions, making cross-scenario comparison sharper; (2) coherence and human-likeness — two dimensions the pre-Phase-7 dataset didn't cover at all — now have universal coverage.</w:t>
+      </w:r>
+    </w:p>
+    <w:p>
+      <w:r>
+        <w:rPr>
+          <w:b w:val="0"/>
+          <w:i w:val="0"/>
+        </w:rPr>
+        <w:t>Sidecar fix: `evals/scorers/llm_rubric.py::DEFAULT_RUBRIC_JUDGE` `max_tokens` raised 1024 → 3072 to accommodate the ~12-item rubrics (3–5 scenario-specific + 8 BEA). The first run after the BEA migration failed with JSON parse errors because Haiku's response truncated mid-string at the 1024-token cap.</w:t>
+      </w:r>
+    </w:p>
+    <w:p>
+      <w:pPr>
+        <w:pStyle w:val="Heading2"/>
+      </w:pPr>
+      <w:r>
+        <w:t>32. Engine target: simple_tutor going forward</w:t>
+      </w:r>
+    </w:p>
+    <w:p>
+      <w:r>
+        <w:rPr>
+          <w:b w:val="0"/>
+          <w:i w:val="0"/>
+        </w:rPr>
+        <w:t>A merge with the dev branch (2026-05-27) brought in the `simple_tutor` engine — a lighter-weight conversational tutor architecture that runs alongside the original `ConversationalTutor`. Going forward, evaluations are run against `simple_tutor`, controlled by the `SIMPLE_TUTOR_ENGINE` env var. `evals/runner.py` honours it for single-turn scenarios; `apps/tutoring/student_sim/driver.py` honours it for multi-turn. The rubric items themselves are engine-agnostic — they describe properties of the response text, not engine internals — so the same dataset evaluates either engine.</w:t>
       </w:r>
     </w:p>
     <w:p>
@@ -5585,7 +6065,7 @@
         <w:pStyle w:val="Heading2"/>
       </w:pPr>
       <w:r>
-        <w:t>30. Where everything lives in the code</w:t>
+        <w:t>33. Where everything lives in the code</w:t>
       </w:r>
     </w:p>
     <w:tbl>
@@ -5919,7 +6399,7 @@
         <w:pStyle w:val="Heading2"/>
       </w:pPr>
       <w:r>
-        <w:t>31. Glossary</w:t>
+        <w:t>34. Glossary</w:t>
       </w:r>
     </w:p>
     <w:tbl>
@@ -6319,7 +6799,7 @@
         <w:pStyle w:val="Heading2"/>
       </w:pPr>
       <w:r>
-        <w:t>32. Future work</w:t>
+        <w:t>35. Future work</w:t>
       </w:r>
     </w:p>
     <w:p>
@@ -6384,7 +6864,7 @@
         <w:pStyle w:val="Heading2"/>
       </w:pPr>
       <w:r>
-        <w:t>33. One-paragraph closing</w:t>
+        <w:t>36. One-paragraph closing</w:t>
       </w:r>
     </w:p>
     <w:p>

</xml_diff>